<commit_message>
docs: indice popolato — titoli con stili Heading Word e aggiornamento campi all'apertura
I titoli erano paragrafi formattati a mano: identici a vedersi, ma l'indice
raccoglie per STILE e non trovava nulla. Ora h1/h2/h3 usano Heading 1/2/3,
con l'aspetto brand definito in styles.paragraphStyles, e il documento
chiede a Word di aggiornare i campi all'apertura.

Il titolo della pagina Indice resta fuori dallo stile Heading: altrimenti
si elencava come prima voce di se stesso.
</commit_message>
<xml_diff>
--- a/docs/PC_FM_Dashboard_Guida.docx
+++ b/docs/PC_FM_Dashboard_Guida.docx
@@ -175,7 +175,7 @@
           <w:sz w:val="20"/>
           <w:szCs w:val="20"/>
         </w:rPr>
-        <w:t xml:space="preserve">L’indice si popola all’apertura del documento in Word: se i numeri di pagina non compaiono, seleziona tutto (Ctrl+A) e premi F9, oppure clic destro sull’indice → "Aggiorna campo".</w:t>
+        <w:t xml:space="preserve">L’indice si aggiorna da solo all’apertura in Word. Se dopo una modifica i numeri di pagina non fossero allineati: clic destro sull’indice → "Aggiorna campo" → "Aggiorna intero sommario".</w:t>
       </w:r>
     </w:p>
     <w:sdt>
@@ -204,36 +204,20 @@
     </w:p>
     <w:p>
       <w:pPr>
+        <w:pStyle w:val="Heading1"/>
         <w:pBdr>
           <w:bottom w:val="single" w:color="1546D4" w:sz="12" w:space="6"/>
         </w:pBdr>
-        <w:spacing w:after="160" w:before="320"/>
-      </w:pPr>
-      <w:r>
-        <w:rPr>
-          <w:rFonts w:ascii="Calibri" w:cs="Calibri" w:eastAsia="Calibri" w:hAnsi="Calibri"/>
-          <w:b/>
-          <w:bCs/>
-          <w:color w:val="1546D4"/>
-          <w:sz w:val="36"/>
-          <w:szCs w:val="36"/>
-        </w:rPr>
+      </w:pPr>
+      <w:r>
         <w:t xml:space="preserve">1. Cos’è la FM Dashboard</w:t>
       </w:r>
     </w:p>
     <w:p>
       <w:pPr>
-        <w:spacing w:after="110" w:before="260"/>
-      </w:pPr>
-      <w:r>
-        <w:rPr>
-          <w:rFonts w:ascii="Calibri" w:cs="Calibri" w:eastAsia="Calibri" w:hAnsi="Calibri"/>
-          <w:b/>
-          <w:bCs/>
-          <w:color w:val="0F0F0F"/>
-          <w:sz w:val="28"/>
-          <w:szCs w:val="28"/>
-        </w:rPr>
+        <w:pStyle w:val="Heading2"/>
+      </w:pPr>
+      <w:r>
         <w:t xml:space="preserve">1.1 Obiettivo del prodotto</w:t>
       </w:r>
     </w:p>
@@ -304,17 +288,9 @@
     </w:p>
     <w:p>
       <w:pPr>
-        <w:spacing w:after="110" w:before="260"/>
-      </w:pPr>
-      <w:r>
-        <w:rPr>
-          <w:rFonts w:ascii="Calibri" w:cs="Calibri" w:eastAsia="Calibri" w:hAnsi="Calibri"/>
-          <w:b/>
-          <w:bCs/>
-          <w:color w:val="0F0F0F"/>
-          <w:sz w:val="28"/>
-          <w:szCs w:val="28"/>
-        </w:rPr>
+        <w:pStyle w:val="Heading2"/>
+      </w:pPr>
+      <w:r>
         <w:t xml:space="preserve">1.2 I tre ruoli</w:t>
       </w:r>
     </w:p>
@@ -789,17 +765,9 @@
     </w:tbl>
     <w:p>
       <w:pPr>
-        <w:spacing w:after="80" w:before="190"/>
-      </w:pPr>
-      <w:r>
-        <w:rPr>
-          <w:rFonts w:ascii="Calibri" w:cs="Calibri" w:eastAsia="Calibri" w:hAnsi="Calibri"/>
-          <w:b/>
-          <w:bCs/>
-          <w:color w:val="1546D4"/>
-          <w:sz w:val="24"/>
-          <w:szCs w:val="24"/>
-        </w:rPr>
+        <w:pStyle w:val="Heading3"/>
+      </w:pPr>
+      <w:r>
         <w:t xml:space="preserve">Accesso su invito</w:t>
       </w:r>
     </w:p>
@@ -897,17 +865,9 @@
     </w:p>
     <w:p>
       <w:pPr>
-        <w:spacing w:after="110" w:before="260"/>
-      </w:pPr>
-      <w:r>
-        <w:rPr>
-          <w:rFonts w:ascii="Calibri" w:cs="Calibri" w:eastAsia="Calibri" w:hAnsi="Calibri"/>
-          <w:b/>
-          <w:bCs/>
-          <w:color w:val="0F0F0F"/>
-          <w:sz w:val="28"/>
-          <w:szCs w:val="28"/>
-        </w:rPr>
+        <w:pStyle w:val="Heading2"/>
+      </w:pPr>
+      <w:r>
         <w:t xml:space="preserve">1.3 Le due modalità operative</w:t>
       </w:r>
     </w:p>
@@ -1755,17 +1715,9 @@
     </w:tbl>
     <w:p>
       <w:pPr>
-        <w:spacing w:after="80" w:before="190"/>
-      </w:pPr>
-      <w:r>
-        <w:rPr>
-          <w:rFonts w:ascii="Calibri" w:cs="Calibri" w:eastAsia="Calibri" w:hAnsi="Calibri"/>
-          <w:b/>
-          <w:bCs/>
-          <w:color w:val="1546D4"/>
-          <w:sz w:val="24"/>
-          <w:szCs w:val="24"/>
-        </w:rPr>
+        <w:pStyle w:val="Heading3"/>
+      </w:pPr>
+      <w:r>
         <w:t xml:space="preserve">Come si cambia modalità</w:t>
       </w:r>
     </w:p>
@@ -1829,17 +1781,9 @@
     </w:p>
     <w:p>
       <w:pPr>
-        <w:spacing w:after="110" w:before="260"/>
-      </w:pPr>
-      <w:r>
-        <w:rPr>
-          <w:rFonts w:ascii="Calibri" w:cs="Calibri" w:eastAsia="Calibri" w:hAnsi="Calibri"/>
-          <w:b/>
-          <w:bCs/>
-          <w:color w:val="0F0F0F"/>
-          <w:sz w:val="28"/>
-          <w:szCs w:val="28"/>
-        </w:rPr>
+        <w:pStyle w:val="Heading2"/>
+      </w:pPr>
+      <w:r>
         <w:t xml:space="preserve">1.4 Accesso alla demo</w:t>
       </w:r>
     </w:p>
@@ -2300,17 +2244,9 @@
     </w:p>
     <w:p>
       <w:pPr>
-        <w:spacing w:after="80" w:before="190"/>
-      </w:pPr>
-      <w:r>
-        <w:rPr>
-          <w:rFonts w:ascii="Calibri" w:cs="Calibri" w:eastAsia="Calibri" w:hAnsi="Calibri"/>
-          <w:b/>
-          <w:bCs/>
-          <w:color w:val="1546D4"/>
-          <w:sz w:val="24"/>
-          <w:szCs w:val="24"/>
-        </w:rPr>
+        <w:pStyle w:val="Heading3"/>
+      </w:pPr>
+      <w:r>
         <w:t xml:space="preserve">Dati della demo</w:t>
       </w:r>
     </w:p>
@@ -2738,20 +2674,12 @@
     </w:p>
     <w:p>
       <w:pPr>
+        <w:pStyle w:val="Heading1"/>
         <w:pBdr>
           <w:bottom w:val="single" w:color="1546D4" w:sz="12" w:space="6"/>
         </w:pBdr>
-        <w:spacing w:after="160" w:before="320"/>
-      </w:pPr>
-      <w:r>
-        <w:rPr>
-          <w:rFonts w:ascii="Calibri" w:cs="Calibri" w:eastAsia="Calibri" w:hAnsi="Calibri"/>
-          <w:b/>
-          <w:bCs/>
-          <w:color w:val="1546D4"/>
-          <w:sz w:val="36"/>
-          <w:szCs w:val="36"/>
-        </w:rPr>
+      </w:pPr>
+      <w:r>
         <w:t xml:space="preserve">2. Guida funzionale</w:t>
       </w:r>
     </w:p>
@@ -2792,17 +2720,9 @@
     </w:p>
     <w:p>
       <w:pPr>
-        <w:spacing w:after="110" w:before="260"/>
-      </w:pPr>
-      <w:r>
-        <w:rPr>
-          <w:rFonts w:ascii="Calibri" w:cs="Calibri" w:eastAsia="Calibri" w:hAnsi="Calibri"/>
-          <w:b/>
-          <w:bCs/>
-          <w:color w:val="0F0F0F"/>
-          <w:sz w:val="28"/>
-          <w:szCs w:val="28"/>
-        </w:rPr>
+        <w:pStyle w:val="Heading2"/>
+      </w:pPr>
+      <w:r>
         <w:t xml:space="preserve">2.1 Dashboard Live</w:t>
       </w:r>
     </w:p>
@@ -3301,17 +3221,9 @@
     </w:p>
     <w:p>
       <w:pPr>
-        <w:spacing w:after="110" w:before="260"/>
-      </w:pPr>
-      <w:r>
-        <w:rPr>
-          <w:rFonts w:ascii="Calibri" w:cs="Calibri" w:eastAsia="Calibri" w:hAnsi="Calibri"/>
-          <w:b/>
-          <w:bCs/>
-          <w:color w:val="0F0F0F"/>
-          <w:sz w:val="28"/>
-          <w:szCs w:val="28"/>
-        </w:rPr>
+        <w:pStyle w:val="Heading2"/>
+      </w:pPr>
+      <w:r>
         <w:t xml:space="preserve">2.2 Mappa Stalli</w:t>
       </w:r>
     </w:p>
@@ -3867,17 +3779,9 @@
     </w:p>
     <w:p>
       <w:pPr>
-        <w:spacing w:after="110" w:before="260"/>
-      </w:pPr>
-      <w:r>
-        <w:rPr>
-          <w:rFonts w:ascii="Calibri" w:cs="Calibri" w:eastAsia="Calibri" w:hAnsi="Calibri"/>
-          <w:b/>
-          <w:bCs/>
-          <w:color w:val="0F0F0F"/>
-          <w:sz w:val="28"/>
-          <w:szCs w:val="28"/>
-        </w:rPr>
+        <w:pStyle w:val="Heading2"/>
+      </w:pPr>
+      <w:r>
         <w:t xml:space="preserve">2.3 Accessi</w:t>
       </w:r>
     </w:p>
@@ -4434,17 +4338,9 @@
     </w:p>
     <w:p>
       <w:pPr>
-        <w:spacing w:after="110" w:before="260"/>
-      </w:pPr>
-      <w:r>
-        <w:rPr>
-          <w:rFonts w:ascii="Calibri" w:cs="Calibri" w:eastAsia="Calibri" w:hAnsi="Calibri"/>
-          <w:b/>
-          <w:bCs/>
-          <w:color w:val="0F0F0F"/>
-          <w:sz w:val="28"/>
-          <w:szCs w:val="28"/>
-        </w:rPr>
+        <w:pStyle w:val="Heading2"/>
+      </w:pPr>
+      <w:r>
         <w:t xml:space="preserve">2.4 Prenotazioni</w:t>
       </w:r>
     </w:p>
@@ -5095,17 +4991,9 @@
     </w:p>
     <w:p>
       <w:pPr>
-        <w:spacing w:after="110" w:before="260"/>
-      </w:pPr>
-      <w:r>
-        <w:rPr>
-          <w:rFonts w:ascii="Calibri" w:cs="Calibri" w:eastAsia="Calibri" w:hAnsi="Calibri"/>
-          <w:b/>
-          <w:bCs/>
-          <w:color w:val="0F0F0F"/>
-          <w:sz w:val="28"/>
-          <w:szCs w:val="28"/>
-        </w:rPr>
+        <w:pStyle w:val="Heading2"/>
+      </w:pPr>
+      <w:r>
         <w:t xml:space="preserve">2.5 Segnalazioni</w:t>
       </w:r>
     </w:p>
@@ -5680,17 +5568,9 @@
     </w:p>
     <w:p>
       <w:pPr>
-        <w:spacing w:after="110" w:before="260"/>
-      </w:pPr>
-      <w:r>
-        <w:rPr>
-          <w:rFonts w:ascii="Calibri" w:cs="Calibri" w:eastAsia="Calibri" w:hAnsi="Calibri"/>
-          <w:b/>
-          <w:bCs/>
-          <w:color w:val="0F0F0F"/>
-          <w:sz w:val="28"/>
-          <w:szCs w:val="28"/>
-        </w:rPr>
+        <w:pStyle w:val="Heading2"/>
+      </w:pPr>
+      <w:r>
         <w:t xml:space="preserve">2.6 Analytics</w:t>
       </w:r>
     </w:p>
@@ -6096,17 +5976,9 @@
     </w:p>
     <w:p>
       <w:pPr>
-        <w:spacing w:after="110" w:before="260"/>
-      </w:pPr>
-      <w:r>
-        <w:rPr>
-          <w:rFonts w:ascii="Calibri" w:cs="Calibri" w:eastAsia="Calibri" w:hAnsi="Calibri"/>
-          <w:b/>
-          <w:bCs/>
-          <w:color w:val="0F0F0F"/>
-          <w:sz w:val="28"/>
-          <w:szCs w:val="28"/>
-        </w:rPr>
+        <w:pStyle w:val="Heading2"/>
+      </w:pPr>
+      <w:r>
         <w:t xml:space="preserve">2.7 Dipendenti</w:t>
       </w:r>
     </w:p>
@@ -6755,17 +6627,9 @@
     </w:p>
     <w:p>
       <w:pPr>
-        <w:spacing w:after="110" w:before="260"/>
-      </w:pPr>
-      <w:r>
-        <w:rPr>
-          <w:rFonts w:ascii="Calibri" w:cs="Calibri" w:eastAsia="Calibri" w:hAnsi="Calibri"/>
-          <w:b/>
-          <w:bCs/>
-          <w:color w:val="0F0F0F"/>
-          <w:sz w:val="28"/>
-          <w:szCs w:val="28"/>
-        </w:rPr>
+        <w:pStyle w:val="Heading2"/>
+      </w:pPr>
+      <w:r>
         <w:t xml:space="preserve">2.8 Visitatori</w:t>
       </w:r>
     </w:p>
@@ -7340,17 +7204,9 @@
     </w:p>
     <w:p>
       <w:pPr>
-        <w:spacing w:after="110" w:before="260"/>
-      </w:pPr>
-      <w:r>
-        <w:rPr>
-          <w:rFonts w:ascii="Calibri" w:cs="Calibri" w:eastAsia="Calibri" w:hAnsi="Calibri"/>
-          <w:b/>
-          <w:bCs/>
-          <w:color w:val="0F0F0F"/>
-          <w:sz w:val="28"/>
-          <w:szCs w:val="28"/>
-        </w:rPr>
+        <w:pStyle w:val="Heading2"/>
+      </w:pPr>
+      <w:r>
         <w:t xml:space="preserve">2.9 Hardware</w:t>
       </w:r>
     </w:p>
@@ -7813,17 +7669,9 @@
     </w:p>
     <w:p>
       <w:pPr>
-        <w:spacing w:after="110" w:before="260"/>
-      </w:pPr>
-      <w:r>
-        <w:rPr>
-          <w:rFonts w:ascii="Calibri" w:cs="Calibri" w:eastAsia="Calibri" w:hAnsi="Calibri"/>
-          <w:b/>
-          <w:bCs/>
-          <w:color w:val="0F0F0F"/>
-          <w:sz w:val="28"/>
-          <w:szCs w:val="28"/>
-        </w:rPr>
+        <w:pStyle w:val="Heading2"/>
+      </w:pPr>
+      <w:r>
         <w:t xml:space="preserve">2.10 Policy &amp; Config</w:t>
       </w:r>
     </w:p>
@@ -8360,17 +8208,9 @@
     </w:p>
     <w:p>
       <w:pPr>
-        <w:spacing w:after="110" w:before="260"/>
-      </w:pPr>
-      <w:r>
-        <w:rPr>
-          <w:rFonts w:ascii="Calibri" w:cs="Calibri" w:eastAsia="Calibri" w:hAnsi="Calibri"/>
-          <w:b/>
-          <w:bCs/>
-          <w:color w:val="0F0F0F"/>
-          <w:sz w:val="28"/>
-          <w:szCs w:val="28"/>
-        </w:rPr>
+        <w:pStyle w:val="Heading2"/>
+      </w:pPr>
+      <w:r>
         <w:t xml:space="preserve">2.11 Esporta Report</w:t>
       </w:r>
     </w:p>
@@ -8741,17 +8581,9 @@
     </w:p>
     <w:p>
       <w:pPr>
-        <w:spacing w:after="110" w:before="260"/>
-      </w:pPr>
-      <w:r>
-        <w:rPr>
-          <w:rFonts w:ascii="Calibri" w:cs="Calibri" w:eastAsia="Calibri" w:hAnsi="Calibri"/>
-          <w:b/>
-          <w:bCs/>
-          <w:color w:val="0F0F0F"/>
-          <w:sz w:val="28"/>
-          <w:szCs w:val="28"/>
-        </w:rPr>
+        <w:pStyle w:val="Heading2"/>
+      </w:pPr>
+      <w:r>
         <w:t xml:space="preserve">2.12 Amministrazione (solo Admin)</w:t>
       </w:r>
     </w:p>
@@ -9250,17 +9082,9 @@
     </w:p>
     <w:p>
       <w:pPr>
-        <w:spacing w:after="110" w:before="260"/>
-      </w:pPr>
-      <w:r>
-        <w:rPr>
-          <w:rFonts w:ascii="Calibri" w:cs="Calibri" w:eastAsia="Calibri" w:hAnsi="Calibri"/>
-          <w:b/>
-          <w:bCs/>
-          <w:color w:val="0F0F0F"/>
-          <w:sz w:val="28"/>
-          <w:szCs w:val="28"/>
-        </w:rPr>
+        <w:pStyle w:val="Heading2"/>
+      </w:pPr>
+      <w:r>
         <w:t xml:space="preserve">2.13 Vista Dipendente</w:t>
       </w:r>
     </w:p>
@@ -10028,36 +9852,20 @@
     </w:p>
     <w:p>
       <w:pPr>
+        <w:pStyle w:val="Heading1"/>
         <w:pBdr>
           <w:bottom w:val="single" w:color="1546D4" w:sz="12" w:space="6"/>
         </w:pBdr>
-        <w:spacing w:after="160" w:before="320"/>
-      </w:pPr>
-      <w:r>
-        <w:rPr>
-          <w:rFonts w:ascii="Calibri" w:cs="Calibri" w:eastAsia="Calibri" w:hAnsi="Calibri"/>
-          <w:b/>
-          <w:bCs/>
-          <w:color w:val="1546D4"/>
-          <w:sz w:val="36"/>
-          <w:szCs w:val="36"/>
-        </w:rPr>
+      </w:pPr>
+      <w:r>
         <w:t xml:space="preserve">3. Piano di test</w:t>
       </w:r>
     </w:p>
     <w:p>
       <w:pPr>
-        <w:spacing w:after="110" w:before="260"/>
-      </w:pPr>
-      <w:r>
-        <w:rPr>
-          <w:rFonts w:ascii="Calibri" w:cs="Calibri" w:eastAsia="Calibri" w:hAnsi="Calibri"/>
-          <w:b/>
-          <w:bCs/>
-          <w:color w:val="0F0F0F"/>
-          <w:sz w:val="28"/>
-          <w:szCs w:val="28"/>
-        </w:rPr>
+        <w:pStyle w:val="Heading2"/>
+      </w:pPr>
+      <w:r>
         <w:t xml:space="preserve">3.1 Come usare questo piano</w:t>
       </w:r>
     </w:p>
@@ -10178,17 +9986,9 @@
     </w:p>
     <w:p>
       <w:pPr>
-        <w:spacing w:after="110" w:before="260"/>
-      </w:pPr>
-      <w:r>
-        <w:rPr>
-          <w:rFonts w:ascii="Calibri" w:cs="Calibri" w:eastAsia="Calibri" w:hAnsi="Calibri"/>
-          <w:b/>
-          <w:bCs/>
-          <w:color w:val="0F0F0F"/>
-          <w:sz w:val="28"/>
-          <w:szCs w:val="28"/>
-        </w:rPr>
+        <w:pStyle w:val="Heading2"/>
+      </w:pPr>
+      <w:r>
         <w:t xml:space="preserve">3.2 Checklist Admin</w:t>
       </w:r>
     </w:p>
@@ -13390,33 +13190,17 @@
     </w:tbl>
     <w:p>
       <w:pPr>
-        <w:spacing w:after="110" w:before="260"/>
-      </w:pPr>
-      <w:r>
-        <w:rPr>
-          <w:rFonts w:ascii="Calibri" w:cs="Calibri" w:eastAsia="Calibri" w:hAnsi="Calibri"/>
-          <w:b/>
-          <w:bCs/>
-          <w:color w:val="0F0F0F"/>
-          <w:sz w:val="28"/>
-          <w:szCs w:val="28"/>
-        </w:rPr>
+        <w:pStyle w:val="Heading2"/>
+      </w:pPr>
+      <w:r>
         <w:t xml:space="preserve">3.3 Checklist Facility Manager</w:t>
       </w:r>
     </w:p>
     <w:p>
       <w:pPr>
-        <w:spacing w:after="80" w:before="190"/>
-      </w:pPr>
-      <w:r>
-        <w:rPr>
-          <w:rFonts w:ascii="Calibri" w:cs="Calibri" w:eastAsia="Calibri" w:hAnsi="Calibri"/>
-          <w:b/>
-          <w:bCs/>
-          <w:color w:val="1546D4"/>
-          <w:sz w:val="24"/>
-          <w:szCs w:val="24"/>
-        </w:rPr>
+        <w:pStyle w:val="Heading3"/>
+      </w:pPr>
+      <w:r>
         <w:t xml:space="preserve">Dashboard, Mappa, Accessi</w:t>
       </w:r>
     </w:p>
@@ -16618,17 +16402,9 @@
     </w:tbl>
     <w:p>
       <w:pPr>
-        <w:spacing w:after="80" w:before="190"/>
-      </w:pPr>
-      <w:r>
-        <w:rPr>
-          <w:rFonts w:ascii="Calibri" w:cs="Calibri" w:eastAsia="Calibri" w:hAnsi="Calibri"/>
-          <w:b/>
-          <w:bCs/>
-          <w:color w:val="1546D4"/>
-          <w:sz w:val="24"/>
-          <w:szCs w:val="24"/>
-        </w:rPr>
+        <w:pStyle w:val="Heading3"/>
+      </w:pPr>
+      <w:r>
         <w:t xml:space="preserve">Prenotazioni, Segnalazioni, Analytics</w:t>
       </w:r>
     </w:p>
@@ -20462,17 +20238,9 @@
     </w:tbl>
     <w:p>
       <w:pPr>
-        <w:spacing w:after="80" w:before="190"/>
-      </w:pPr>
-      <w:r>
-        <w:rPr>
-          <w:rFonts w:ascii="Calibri" w:cs="Calibri" w:eastAsia="Calibri" w:hAnsi="Calibri"/>
-          <w:b/>
-          <w:bCs/>
-          <w:color w:val="1546D4"/>
-          <w:sz w:val="24"/>
-          <w:szCs w:val="24"/>
-        </w:rPr>
+        <w:pStyle w:val="Heading3"/>
+      </w:pPr>
+      <w:r>
         <w:t xml:space="preserve">Dipendenti, Visitatori, Hardware, Configurazione, Export</w:t>
       </w:r>
     </w:p>
@@ -27150,17 +26918,9 @@
     </w:tbl>
     <w:p>
       <w:pPr>
-        <w:spacing w:after="110" w:before="260"/>
-      </w:pPr>
-      <w:r>
-        <w:rPr>
-          <w:rFonts w:ascii="Calibri" w:cs="Calibri" w:eastAsia="Calibri" w:hAnsi="Calibri"/>
-          <w:b/>
-          <w:bCs/>
-          <w:color w:val="0F0F0F"/>
-          <w:sz w:val="28"/>
-          <w:szCs w:val="28"/>
-        </w:rPr>
+        <w:pStyle w:val="Heading2"/>
+      </w:pPr>
+      <w:r>
         <w:t xml:space="preserve">3.4 Checklist Dipendente — Modalità Uffici</w:t>
       </w:r>
     </w:p>
@@ -31942,17 +31702,9 @@
     </w:tbl>
     <w:p>
       <w:pPr>
-        <w:spacing w:after="110" w:before="260"/>
-      </w:pPr>
-      <w:r>
-        <w:rPr>
-          <w:rFonts w:ascii="Calibri" w:cs="Calibri" w:eastAsia="Calibri" w:hAnsi="Calibri"/>
-          <w:b/>
-          <w:bCs/>
-          <w:color w:val="0F0F0F"/>
-          <w:sz w:val="28"/>
-          <w:szCs w:val="28"/>
-        </w:rPr>
+        <w:pStyle w:val="Heading2"/>
+      </w:pPr>
+      <w:r>
         <w:t xml:space="preserve">3.5 Checklist Dipendente — Modalità Ospedale</w:t>
       </w:r>
     </w:p>
@@ -34221,17 +33973,9 @@
     </w:tbl>
     <w:p>
       <w:pPr>
-        <w:spacing w:after="110" w:before="260"/>
-      </w:pPr>
-      <w:r>
-        <w:rPr>
-          <w:rFonts w:ascii="Calibri" w:cs="Calibri" w:eastAsia="Calibri" w:hAnsi="Calibri"/>
-          <w:b/>
-          <w:bCs/>
-          <w:color w:val="0F0F0F"/>
-          <w:sz w:val="28"/>
-          <w:szCs w:val="28"/>
-        </w:rPr>
+        <w:pStyle w:val="Heading2"/>
+      </w:pPr>
+      <w:r>
         <w:t xml:space="preserve">3.6 Flussi cross-ruolo (stessa tab)</w:t>
       </w:r>
     </w:p>
@@ -37240,17 +36984,9 @@
     </w:tbl>
     <w:p>
       <w:pPr>
-        <w:spacing w:after="110" w:before="260"/>
-      </w:pPr>
-      <w:r>
-        <w:rPr>
-          <w:rFonts w:ascii="Calibri" w:cs="Calibri" w:eastAsia="Calibri" w:hAnsi="Calibri"/>
-          <w:b/>
-          <w:bCs/>
-          <w:color w:val="0F0F0F"/>
-          <w:sz w:val="28"/>
-          <w:szCs w:val="28"/>
-        </w:rPr>
+        <w:pStyle w:val="Heading2"/>
+      </w:pPr>
+      <w:r>
         <w:t xml:space="preserve">3.7 I dieci flussi prioritari</w:t>
       </w:r>
     </w:p>
@@ -38183,20 +37919,12 @@
     </w:p>
     <w:p>
       <w:pPr>
+        <w:pStyle w:val="Heading1"/>
         <w:pBdr>
           <w:bottom w:val="single" w:color="1546D4" w:sz="12" w:space="6"/>
         </w:pBdr>
-        <w:spacing w:after="160" w:before="320"/>
-      </w:pPr>
-      <w:r>
-        <w:rPr>
-          <w:rFonts w:ascii="Calibri" w:cs="Calibri" w:eastAsia="Calibri" w:hAnsi="Calibri"/>
-          <w:b/>
-          <w:bCs/>
-          <w:color w:val="1546D4"/>
-          <w:sz w:val="36"/>
-          <w:szCs w:val="36"/>
-        </w:rPr>
+      </w:pPr>
+      <w:r>
         <w:t xml:space="preserve">4. Cosa è simulato e cosa è reale</w:t>
       </w:r>
     </w:p>
@@ -40009,20 +39737,12 @@
     </w:p>
     <w:p>
       <w:pPr>
+        <w:pStyle w:val="Heading1"/>
         <w:pBdr>
           <w:bottom w:val="single" w:color="1546D4" w:sz="12" w:space="6"/>
         </w:pBdr>
-        <w:spacing w:after="160" w:before="320"/>
-      </w:pPr>
-      <w:r>
-        <w:rPr>
-          <w:rFonts w:ascii="Calibri" w:cs="Calibri" w:eastAsia="Calibri" w:hAnsi="Calibri"/>
-          <w:b/>
-          <w:bCs/>
-          <w:color w:val="1546D4"/>
-          <w:sz w:val="36"/>
-          <w:szCs w:val="36"/>
-        </w:rPr>
+      </w:pPr>
+      <w:r>
         <w:t xml:space="preserve">5. Limitazioni note</w:t>
       </w:r>
     </w:p>
@@ -40468,36 +40188,20 @@
     </w:p>
     <w:p>
       <w:pPr>
+        <w:pStyle w:val="Heading1"/>
         <w:pBdr>
           <w:bottom w:val="single" w:color="1546D4" w:sz="12" w:space="6"/>
         </w:pBdr>
-        <w:spacing w:after="160" w:before="320"/>
-      </w:pPr>
-      <w:r>
-        <w:rPr>
-          <w:rFonts w:ascii="Calibri" w:cs="Calibri" w:eastAsia="Calibri" w:hAnsi="Calibri"/>
-          <w:b/>
-          <w:bCs/>
-          <w:color w:val="1546D4"/>
-          <w:sz w:val="36"/>
-          <w:szCs w:val="36"/>
-        </w:rPr>
+      </w:pPr>
+      <w:r>
         <w:t xml:space="preserve">6. Come segnalare i bug</w:t>
       </w:r>
     </w:p>
     <w:p>
       <w:pPr>
-        <w:spacing w:after="110" w:before="260"/>
-      </w:pPr>
-      <w:r>
-        <w:rPr>
-          <w:rFonts w:ascii="Calibri" w:cs="Calibri" w:eastAsia="Calibri" w:hAnsi="Calibri"/>
-          <w:b/>
-          <w:bCs/>
-          <w:color w:val="0F0F0F"/>
-          <w:sz w:val="28"/>
-          <w:szCs w:val="28"/>
-        </w:rPr>
+        <w:pStyle w:val="Heading2"/>
+      </w:pPr>
+      <w:r>
         <w:t xml:space="preserve">6.1 Modello di segnalazione</w:t>
       </w:r>
     </w:p>
@@ -41102,17 +40806,9 @@
     </w:p>
     <w:p>
       <w:pPr>
-        <w:spacing w:after="110" w:before="260"/>
-      </w:pPr>
-      <w:r>
-        <w:rPr>
-          <w:rFonts w:ascii="Calibri" w:cs="Calibri" w:eastAsia="Calibri" w:hAnsi="Calibri"/>
-          <w:b/>
-          <w:bCs/>
-          <w:color w:val="0F0F0F"/>
-          <w:sz w:val="28"/>
-          <w:szCs w:val="28"/>
-        </w:rPr>
+        <w:pStyle w:val="Heading2"/>
+      </w:pPr>
+      <w:r>
         <w:t xml:space="preserve">6.2 Classificazione della priorità</w:t>
       </w:r>
     </w:p>
@@ -41545,17 +41241,9 @@
     </w:tbl>
     <w:p>
       <w:pPr>
-        <w:spacing w:after="110" w:before="260"/>
-      </w:pPr>
-      <w:r>
-        <w:rPr>
-          <w:rFonts w:ascii="Calibri" w:cs="Calibri" w:eastAsia="Calibri" w:hAnsi="Calibri"/>
-          <w:b/>
-          <w:bCs/>
-          <w:color w:val="0F0F0F"/>
-          <w:sz w:val="28"/>
-          <w:szCs w:val="28"/>
-        </w:rPr>
+        <w:pStyle w:val="Heading2"/>
+      </w:pPr>
+      <w:r>
         <w:t xml:space="preserve">6.3 Che cosa non segnalare</w:t>
       </w:r>
     </w:p>
@@ -41791,20 +41479,12 @@
     </w:p>
     <w:p>
       <w:pPr>
+        <w:pStyle w:val="Heading1"/>
         <w:pBdr>
           <w:bottom w:val="single" w:color="1546D4" w:sz="12" w:space="6"/>
         </w:pBdr>
-        <w:spacing w:after="160" w:before="320"/>
-      </w:pPr>
-      <w:r>
-        <w:rPr>
-          <w:rFonts w:ascii="Calibri" w:cs="Calibri" w:eastAsia="Calibri" w:hAnsi="Calibri"/>
-          <w:b/>
-          <w:bCs/>
-          <w:color w:val="1546D4"/>
-          <w:sz w:val="36"/>
-          <w:szCs w:val="36"/>
-        </w:rPr>
+      </w:pPr>
+      <w:r>
         <w:t xml:space="preserve">7. Funzionalità pianificate</w:t>
       </w:r>
     </w:p>
@@ -41830,17 +41510,9 @@
     </w:p>
     <w:p>
       <w:pPr>
-        <w:spacing w:after="110" w:before="260"/>
-      </w:pPr>
-      <w:r>
-        <w:rPr>
-          <w:rFonts w:ascii="Calibri" w:cs="Calibri" w:eastAsia="Calibri" w:hAnsi="Calibri"/>
-          <w:b/>
-          <w:bCs/>
-          <w:color w:val="0F0F0F"/>
-          <w:sz w:val="28"/>
-          <w:szCs w:val="28"/>
-        </w:rPr>
+        <w:pStyle w:val="Heading2"/>
+      </w:pPr>
+      <w:r>
         <w:t xml:space="preserve">7.1 Esperienza d’uso e mobile</w:t>
       </w:r>
     </w:p>
@@ -41865,17 +41537,9 @@
     </w:p>
     <w:p>
       <w:pPr>
-        <w:spacing w:after="110" w:before="260"/>
-      </w:pPr>
-      <w:r>
-        <w:rPr>
-          <w:rFonts w:ascii="Calibri" w:cs="Calibri" w:eastAsia="Calibri" w:hAnsi="Calibri"/>
-          <w:b/>
-          <w:bCs/>
-          <w:color w:val="0F0F0F"/>
-          <w:sz w:val="28"/>
-          <w:szCs w:val="28"/>
-        </w:rPr>
+        <w:pStyle w:val="Heading2"/>
+      </w:pPr>
+      <w:r>
         <w:t xml:space="preserve">7.2 Export</w:t>
       </w:r>
     </w:p>
@@ -41919,17 +41583,9 @@
     </w:p>
     <w:p>
       <w:pPr>
-        <w:spacing w:after="110" w:before="260"/>
-      </w:pPr>
-      <w:r>
-        <w:rPr>
-          <w:rFonts w:ascii="Calibri" w:cs="Calibri" w:eastAsia="Calibri" w:hAnsi="Calibri"/>
-          <w:b/>
-          <w:bCs/>
-          <w:color w:val="0F0F0F"/>
-          <w:sz w:val="28"/>
-          <w:szCs w:val="28"/>
-        </w:rPr>
+        <w:pStyle w:val="Heading2"/>
+      </w:pPr>
+      <w:r>
         <w:t xml:space="preserve">7.3 Backend e dati reali</w:t>
       </w:r>
     </w:p>
@@ -42030,17 +41686,9 @@
     </w:p>
     <w:p>
       <w:pPr>
-        <w:spacing w:after="110" w:before="260"/>
-      </w:pPr>
-      <w:r>
-        <w:rPr>
-          <w:rFonts w:ascii="Calibri" w:cs="Calibri" w:eastAsia="Calibri" w:hAnsi="Calibri"/>
-          <w:b/>
-          <w:bCs/>
-          <w:color w:val="0F0F0F"/>
-          <w:sz w:val="28"/>
-          <w:szCs w:val="28"/>
-        </w:rPr>
+        <w:pStyle w:val="Heading2"/>
+      </w:pPr>
+      <w:r>
         <w:t xml:space="preserve">7.4 Prodotto</w:t>
       </w:r>
     </w:p>
@@ -42160,17 +41808,9 @@
     </w:p>
     <w:p>
       <w:pPr>
-        <w:spacing w:after="110" w:before="260"/>
-      </w:pPr>
-      <w:r>
-        <w:rPr>
-          <w:rFonts w:ascii="Calibri" w:cs="Calibri" w:eastAsia="Calibri" w:hAnsi="Calibri"/>
-          <w:b/>
-          <w:bCs/>
-          <w:color w:val="0F0F0F"/>
-          <w:sz w:val="28"/>
-          <w:szCs w:val="28"/>
-        </w:rPr>
+        <w:pStyle w:val="Heading2"/>
+      </w:pPr>
+      <w:r>
         <w:t xml:space="preserve">7.5 Nota sui fornitori</w:t>
       </w:r>
     </w:p>
@@ -42466,10 +42106,17 @@
     <w:basedOn w:val="Normal"/>
     <w:next w:val="Normal"/>
     <w:qFormat/>
+    <w:pPr>
+      <w:spacing w:after="160" w:before="320"/>
+      <w:outlineLvl w:val="0"/>
+    </w:pPr>
     <w:rPr>
-      <w:color w:val="2E74B5"/>
-      <w:sz w:val="32"/>
-      <w:szCs w:val="32"/>
+      <w:rFonts w:ascii="Calibri" w:cs="Calibri" w:eastAsia="Calibri" w:hAnsi="Calibri"/>
+      <w:b/>
+      <w:bCs/>
+      <w:color w:val="1546D4"/>
+      <w:sz w:val="36"/>
+      <w:szCs w:val="36"/>
     </w:rPr>
   </w:style>
   <w:style w:type="paragraph" w:styleId="Heading2">
@@ -42477,10 +42124,17 @@
     <w:basedOn w:val="Normal"/>
     <w:next w:val="Normal"/>
     <w:qFormat/>
+    <w:pPr>
+      <w:spacing w:after="110" w:before="260"/>
+      <w:outlineLvl w:val="1"/>
+    </w:pPr>
     <w:rPr>
-      <w:color w:val="2E74B5"/>
-      <w:sz w:val="26"/>
-      <w:szCs w:val="26"/>
+      <w:rFonts w:ascii="Calibri" w:cs="Calibri" w:eastAsia="Calibri" w:hAnsi="Calibri"/>
+      <w:b/>
+      <w:bCs/>
+      <w:color w:val="0F0F0F"/>
+      <w:sz w:val="28"/>
+      <w:szCs w:val="28"/>
     </w:rPr>
   </w:style>
   <w:style w:type="paragraph" w:styleId="Heading3">
@@ -42488,8 +42142,15 @@
     <w:basedOn w:val="Normal"/>
     <w:next w:val="Normal"/>
     <w:qFormat/>
+    <w:pPr>
+      <w:spacing w:after="80" w:before="190"/>
+      <w:outlineLvl w:val="2"/>
+    </w:pPr>
     <w:rPr>
-      <w:color w:val="1F4D78"/>
+      <w:rFonts w:ascii="Calibri" w:cs="Calibri" w:eastAsia="Calibri" w:hAnsi="Calibri"/>
+      <w:b/>
+      <w:bCs/>
+      <w:color w:val="1546D4"/>
       <w:sz w:val="24"/>
       <w:szCs w:val="24"/>
     </w:rPr>

</xml_diff>